<commit_message>
final updates of roadmap
</commit_message>
<xml_diff>
--- a/day01/Day 1.docx
+++ b/day01/Day 1.docx
@@ -903,7 +903,15 @@
         </w:tabs>
       </w:pPr>
       <w:r>
-        <w:t xml:space="preserve"> Created and activated  the UV environment:</w:t>
+        <w:t xml:space="preserve"> Created and </w:t>
+      </w:r>
+      <w:proofErr w:type="gramStart"/>
+      <w:r>
+        <w:t>activated  the</w:t>
+      </w:r>
+      <w:proofErr w:type="gramEnd"/>
+      <w:r>
+        <w:t xml:space="preserve"> UV environment:</w:t>
       </w:r>
     </w:p>
     <w:p>
@@ -1008,6 +1016,7 @@
       <w:r>
         <w:t xml:space="preserve">On Windows, </w:t>
       </w:r>
+      <w:proofErr w:type="gramStart"/>
       <w:r>
         <w:rPr>
           <w:b/>
@@ -1024,6 +1033,7 @@
         <w:t>venv</w:t>
       </w:r>
       <w:proofErr w:type="spellEnd"/>
+      <w:proofErr w:type="gramEnd"/>
       <w:r>
         <w:rPr>
           <w:b/>
@@ -1032,7 +1042,11 @@
         <w:t>/bin/activate</w:t>
       </w:r>
       <w:r>
-        <w:t xml:space="preserve"> does not work because it is a Linux/macOS command; the correct activation command is .</w:t>
+        <w:t xml:space="preserve"> does not work because it is a Linux/macOS command; the correct activation command </w:t>
+      </w:r>
+      <w:proofErr w:type="gramStart"/>
+      <w:r>
+        <w:t>is .</w:t>
       </w:r>
       <w:proofErr w:type="spellStart"/>
       <w:r>
@@ -1043,6 +1057,7 @@
         <w:t>venv</w:t>
       </w:r>
       <w:proofErr w:type="spellEnd"/>
+      <w:proofErr w:type="gramEnd"/>
       <w:r>
         <w:rPr>
           <w:b/>
@@ -1082,7 +1097,23 @@
           <w:b/>
           <w:bCs/>
         </w:rPr>
-        <w:t>Write first Python script: app.py with personalized greeting using print()</w:t>
+        <w:t xml:space="preserve">Write first Python script: app.py with personalized greeting using </w:t>
+      </w:r>
+      <w:proofErr w:type="gramStart"/>
+      <w:r>
+        <w:rPr>
+          <w:b/>
+          <w:bCs/>
+        </w:rPr>
+        <w:t>print(</w:t>
+      </w:r>
+      <w:proofErr w:type="gramEnd"/>
+      <w:r>
+        <w:rPr>
+          <w:b/>
+          <w:bCs/>
+        </w:rPr>
+        <w:t>)</w:t>
       </w:r>
     </w:p>
     <w:p>
@@ -1190,10 +1221,18 @@
         <w:t>I</w:t>
       </w:r>
       <w:r>
-        <w:t xml:space="preserve"> already have a GitHub account</w:t>
-      </w:r>
-      <w:r>
-        <w:t xml:space="preserve">, so I’ll </w:t>
+        <w:t xml:space="preserve"> already have a GitHub </w:t>
+      </w:r>
+      <w:proofErr w:type="gramStart"/>
+      <w:r>
+        <w:t>account</w:t>
+      </w:r>
+      <w:r>
+        <w:t>, so</w:t>
+      </w:r>
+      <w:proofErr w:type="gramEnd"/>
+      <w:r>
+        <w:t xml:space="preserve"> I’ll </w:t>
       </w:r>
       <w:r>
         <w:t xml:space="preserve">just configure Git on </w:t>
@@ -1346,7 +1385,15 @@
           <w:b/>
           <w:bCs/>
         </w:rPr>
-        <w:t>Initialize Git repository, create .</w:t>
+        <w:t xml:space="preserve">Initialize Git repository, </w:t>
+      </w:r>
+      <w:proofErr w:type="gramStart"/>
+      <w:r>
+        <w:rPr>
+          <w:b/>
+          <w:bCs/>
+        </w:rPr>
+        <w:t>create .</w:t>
       </w:r>
       <w:proofErr w:type="spellStart"/>
       <w:r>
@@ -1357,6 +1404,7 @@
         <w:t>gitignore</w:t>
       </w:r>
       <w:proofErr w:type="spellEnd"/>
+      <w:proofErr w:type="gramEnd"/>
       <w:r>
         <w:rPr>
           <w:b/>
@@ -1426,7 +1474,23 @@
           <w:b/>
           <w:bCs/>
         </w:rPr>
-        <w:t>Steps I followed:</w:t>
+        <w:t xml:space="preserve">Steps I </w:t>
+      </w:r>
+      <w:proofErr w:type="gramStart"/>
+      <w:r>
+        <w:rPr>
+          <w:b/>
+          <w:bCs/>
+        </w:rPr>
+        <w:t>followed</w:t>
+      </w:r>
+      <w:proofErr w:type="gramEnd"/>
+      <w:r>
+        <w:rPr>
+          <w:b/>
+          <w:bCs/>
+        </w:rPr>
+        <w:t>:</w:t>
       </w:r>
     </w:p>
     <w:p>
@@ -1471,6 +1535,7 @@
       <w:r>
         <w:t xml:space="preserve">Created </w:t>
       </w:r>
+      <w:proofErr w:type="gramStart"/>
       <w:r>
         <w:t>“</w:t>
       </w:r>
@@ -1486,12 +1551,14 @@
         <w:t>gitignore</w:t>
       </w:r>
       <w:proofErr w:type="spellEnd"/>
+      <w:proofErr w:type="gramEnd"/>
       <w:r>
         <w:t>”</w:t>
       </w:r>
       <w:r>
         <w:t xml:space="preserve"> to exclude </w:t>
       </w:r>
+      <w:proofErr w:type="gramStart"/>
       <w:r>
         <w:rPr>
           <w:b/>
@@ -1508,6 +1575,7 @@
         <w:t>venv</w:t>
       </w:r>
       <w:proofErr w:type="spellEnd"/>
+      <w:proofErr w:type="gramEnd"/>
       <w:r>
         <w:rPr>
           <w:b/>
@@ -1529,7 +1597,15 @@
           <w:b/>
           <w:bCs/>
         </w:rPr>
-        <w:t>__/, .</w:t>
+        <w:t>__/</w:t>
+      </w:r>
+      <w:proofErr w:type="gramStart"/>
+      <w:r>
+        <w:rPr>
+          <w:b/>
+          <w:bCs/>
+        </w:rPr>
+        <w:t>, .</w:t>
       </w:r>
       <w:proofErr w:type="spellStart"/>
       <w:r>
@@ -1540,6 +1616,7 @@
         <w:t>vscode</w:t>
       </w:r>
       <w:proofErr w:type="spellEnd"/>
+      <w:proofErr w:type="gramEnd"/>
       <w:r>
         <w:rPr>
           <w:b/>
@@ -1589,10 +1666,22 @@
           <w:b/>
           <w:bCs/>
         </w:rPr>
-        <w:t>, git add</w:t>
-      </w:r>
-      <w:r>
-        <w:t xml:space="preserve"> ., and made the first commit</w:t>
+        <w:t xml:space="preserve">, git </w:t>
+      </w:r>
+      <w:proofErr w:type="gramStart"/>
+      <w:r>
+        <w:rPr>
+          <w:b/>
+          <w:bCs/>
+        </w:rPr>
+        <w:t>add</w:t>
+      </w:r>
+      <w:r>
+        <w:t xml:space="preserve"> .</w:t>
+      </w:r>
+      <w:proofErr w:type="gramEnd"/>
+      <w:r>
+        <w:t>, and made the first commit</w:t>
       </w:r>
     </w:p>
     <w:p>
@@ -1816,7 +1905,15 @@
               </w:tabs>
             </w:pPr>
             <w:r>
-              <w:t xml:space="preserve">Removed nested .git using </w:t>
+              <w:t xml:space="preserve">Removed </w:t>
+            </w:r>
+            <w:proofErr w:type="gramStart"/>
+            <w:r>
+              <w:t>nested .git</w:t>
+            </w:r>
+            <w:proofErr w:type="gramEnd"/>
+            <w:r>
+              <w:t xml:space="preserve"> using </w:t>
             </w:r>
             <w:proofErr w:type="spellStart"/>
             <w:r>
@@ -1824,8 +1921,13 @@
             </w:r>
             <w:proofErr w:type="spellEnd"/>
             <w:r>
-              <w:t xml:space="preserve"> /s /q day01\.git</w:t>
+              <w:t xml:space="preserve"> /s /q day01</w:t>
             </w:r>
+            <w:proofErr w:type="gramStart"/>
+            <w:r>
+              <w:t>\.git</w:t>
+            </w:r>
+            <w:proofErr w:type="gramEnd"/>
           </w:p>
         </w:tc>
       </w:tr>
@@ -2106,7 +2208,47 @@
           <w:sz w:val="28"/>
           <w:szCs w:val="28"/>
         </w:rPr>
-        <w:t>Create app.py with: print('Hi, this is [Your Name], future AI engineer!')</w:t>
+        <w:t xml:space="preserve">Create app.py </w:t>
+      </w:r>
+      <w:proofErr w:type="gramStart"/>
+      <w:r>
+        <w:rPr>
+          <w:b/>
+          <w:bCs/>
+          <w:sz w:val="28"/>
+          <w:szCs w:val="28"/>
+        </w:rPr>
+        <w:t>with:</w:t>
+      </w:r>
+      <w:proofErr w:type="gramEnd"/>
+      <w:r>
+        <w:rPr>
+          <w:b/>
+          <w:bCs/>
+          <w:sz w:val="28"/>
+          <w:szCs w:val="28"/>
+        </w:rPr>
+        <w:t xml:space="preserve"> </w:t>
+      </w:r>
+      <w:proofErr w:type="gramStart"/>
+      <w:r>
+        <w:rPr>
+          <w:b/>
+          <w:bCs/>
+          <w:sz w:val="28"/>
+          <w:szCs w:val="28"/>
+        </w:rPr>
+        <w:t>print(</w:t>
+      </w:r>
+      <w:proofErr w:type="gramEnd"/>
+      <w:r>
+        <w:rPr>
+          <w:b/>
+          <w:bCs/>
+          <w:sz w:val="28"/>
+          <w:szCs w:val="28"/>
+        </w:rPr>
+        <w:t>'Hi, this is [Your Name], future AI engineer!')</w:t>
       </w:r>
     </w:p>
     <w:p>
@@ -2326,17 +2468,30 @@
         </w:tabs>
       </w:pPr>
       <w:r>
-        <w:t xml:space="preserve">  data without any guidance. Example: customer segmentation where</w:t>
-      </w:r>
-    </w:p>
-    <w:p>
-      <w:pPr>
-        <w:tabs>
-          <w:tab w:val="left" w:pos="7700"/>
-        </w:tabs>
-      </w:pPr>
-      <w:r>
-        <w:t xml:space="preserve">  the model groups similar customers without being told categories.</w:t>
+        <w:t xml:space="preserve">  data without any guidance. Example: customer segmentation </w:t>
+      </w:r>
+      <w:proofErr w:type="gramStart"/>
+      <w:r>
+        <w:t>where</w:t>
+      </w:r>
+      <w:proofErr w:type="gramEnd"/>
+    </w:p>
+    <w:p>
+      <w:pPr>
+        <w:tabs>
+          <w:tab w:val="left" w:pos="7700"/>
+        </w:tabs>
+      </w:pPr>
+      <w:r>
+        <w:t xml:space="preserve">  </w:t>
+      </w:r>
+      <w:proofErr w:type="gramStart"/>
+      <w:r>
+        <w:t>the</w:t>
+      </w:r>
+      <w:proofErr w:type="gramEnd"/>
+      <w:r>
+        <w:t xml:space="preserve"> model groups similar customers without being told categories.</w:t>
       </w:r>
     </w:p>
     <w:p>
@@ -2390,8 +2545,13 @@
         </w:tabs>
       </w:pPr>
       <w:r>
-        <w:t>- Regression vs Classification: Regression predicts a continuous</w:t>
-      </w:r>
+        <w:t xml:space="preserve">- Regression vs Classification: Regression predicts </w:t>
+      </w:r>
+      <w:proofErr w:type="gramStart"/>
+      <w:r>
+        <w:t>a continuous</w:t>
+      </w:r>
+      <w:proofErr w:type="gramEnd"/>
     </w:p>
     <w:p>
       <w:pPr>
@@ -2477,7 +2637,15 @@
         </w:tabs>
       </w:pPr>
       <w:r>
-        <w:t xml:space="preserve">  statements learned in Day 3.</w:t>
+        <w:t xml:space="preserve">  statements learned </w:t>
+      </w:r>
+      <w:proofErr w:type="gramStart"/>
+      <w:r>
+        <w:t>in</w:t>
+      </w:r>
+      <w:proofErr w:type="gramEnd"/>
+      <w:r>
+        <w:t xml:space="preserve"> Day 3.</w:t>
       </w:r>
     </w:p>
     <w:p>
@@ -2975,7 +3143,23 @@
         </w:tabs>
       </w:pPr>
       <w:r>
-        <w:t xml:space="preserve">   teacher-student analogy for supervised learning</w:t>
+        <w:t xml:space="preserve">   </w:t>
+      </w:r>
+      <w:proofErr w:type="gramStart"/>
+      <w:r>
+        <w:t>teacher</w:t>
+      </w:r>
+      <w:proofErr w:type="gramEnd"/>
+      <w:r>
+        <w:t xml:space="preserve">-student </w:t>
+      </w:r>
+      <w:proofErr w:type="gramStart"/>
+      <w:r>
+        <w:t>analogy</w:t>
+      </w:r>
+      <w:proofErr w:type="gramEnd"/>
+      <w:r>
+        <w:t xml:space="preserve"> for supervised learning</w:t>
       </w:r>
     </w:p>
     <w:p>
@@ -3294,8 +3478,21 @@
           <w:tab w:val="left" w:pos="7700"/>
         </w:tabs>
       </w:pPr>
-      <w:r>
-        <w:t>it visits, it makes the program transparent and easy to debug.</w:t>
+      <w:proofErr w:type="gramStart"/>
+      <w:r>
+        <w:t>it</w:t>
+      </w:r>
+      <w:proofErr w:type="gramEnd"/>
+      <w:r>
+        <w:t xml:space="preserve"> </w:t>
+      </w:r>
+      <w:proofErr w:type="gramStart"/>
+      <w:r>
+        <w:t>visits,</w:t>
+      </w:r>
+      <w:proofErr w:type="gramEnd"/>
+      <w:r>
+        <w:t xml:space="preserve"> it makes the program transparent and easy to debug.</w:t>
       </w:r>
     </w:p>
     <w:p>
@@ -3315,7 +3512,15 @@
         </w:tabs>
       </w:pPr>
       <w:r>
-        <w:t>can explain why it made a decision. This is a critical skill</w:t>
+        <w:t xml:space="preserve">can explain why it </w:t>
+      </w:r>
+      <w:proofErr w:type="gramStart"/>
+      <w:r>
+        <w:t>made a decision</w:t>
+      </w:r>
+      <w:proofErr w:type="gramEnd"/>
+      <w:r>
+        <w:t>. This is a critical skill</w:t>
       </w:r>
     </w:p>
     <w:p>
@@ -3484,7 +3689,15 @@
         </w:tabs>
       </w:pPr>
       <w:r>
-        <w:t xml:space="preserve">  it affect unsupervised learning as well?</w:t>
+        <w:t xml:space="preserve">  it </w:t>
+      </w:r>
+      <w:proofErr w:type="gramStart"/>
+      <w:r>
+        <w:t>affect</w:t>
+      </w:r>
+      <w:proofErr w:type="gramEnd"/>
+      <w:r>
+        <w:t xml:space="preserve"> unsupervised learning as well?</w:t>
       </w:r>
     </w:p>
     <w:p>
@@ -3575,8 +3788,13 @@
         </w:tabs>
       </w:pPr>
       <w:r>
-        <w:t>Remaining task of day 05 :</w:t>
-      </w:r>
+        <w:t xml:space="preserve">Remaining task of day </w:t>
+      </w:r>
+      <w:proofErr w:type="gramStart"/>
+      <w:r>
+        <w:t>05 :</w:t>
+      </w:r>
+      <w:proofErr w:type="gramEnd"/>
     </w:p>
     <w:p>
       <w:pPr>
@@ -3628,7 +3846,7 @@
       </w:pPr>
       <w:r>
         <w:pict w14:anchorId="1ACACC39">
-          <v:rect id="_x0000_i1031" style="width:0;height:1.5pt" o:hralign="center" o:hrstd="t" o:hr="t" fillcolor="#a0a0a0" stroked="f"/>
+          <v:rect id="_x0000_i1025" style="width:0;height:1.5pt" o:hralign="center" o:hrstd="t" o:hr="t" fillcolor="#a0a0a0" stroked="f"/>
         </w:pict>
       </w:r>
     </w:p>
@@ -3710,7 +3928,15 @@
         </w:tabs>
       </w:pPr>
       <w:r>
-        <w:t>Hello, my name is Sehar Andleeb and I am an AI Engineer</w:t>
+        <w:t xml:space="preserve">Hello, my name is Sehar </w:t>
+      </w:r>
+      <w:proofErr w:type="gramStart"/>
+      <w:r>
+        <w:t>Andleeb</w:t>
+      </w:r>
+      <w:proofErr w:type="gramEnd"/>
+      <w:r>
+        <w:t xml:space="preserve"> and I am an AI Engineer</w:t>
       </w:r>
     </w:p>
     <w:p>
@@ -3811,17 +4037,30 @@
         </w:tabs>
       </w:pPr>
       <w:r>
-        <w:t>Classification predicts a category. For example, a spam</w:t>
-      </w:r>
-    </w:p>
-    <w:p>
-      <w:pPr>
-        <w:tabs>
-          <w:tab w:val="left" w:pos="7700"/>
-        </w:tabs>
-      </w:pPr>
-      <w:r>
-        <w:t>filter. You give it an email and it tells you — Spam</w:t>
+        <w:t xml:space="preserve">Classification predicts a category. For example, </w:t>
+      </w:r>
+      <w:proofErr w:type="gramStart"/>
+      <w:r>
+        <w:t>a spam</w:t>
+      </w:r>
+      <w:proofErr w:type="gramEnd"/>
+    </w:p>
+    <w:p>
+      <w:pPr>
+        <w:tabs>
+          <w:tab w:val="left" w:pos="7700"/>
+        </w:tabs>
+      </w:pPr>
+      <w:r>
+        <w:t xml:space="preserve">filter. You give it an </w:t>
+      </w:r>
+      <w:proofErr w:type="gramStart"/>
+      <w:r>
+        <w:t>email</w:t>
+      </w:r>
+      <w:proofErr w:type="gramEnd"/>
+      <w:r>
+        <w:t xml:space="preserve"> and it tells you — Spam</w:t>
       </w:r>
     </w:p>
     <w:p>
@@ -3996,8 +4235,13 @@
         </w:tabs>
       </w:pPr>
       <w:r>
-        <w:t>git add .</w:t>
-      </w:r>
+        <w:t xml:space="preserve">git </w:t>
+      </w:r>
+      <w:proofErr w:type="gramStart"/>
+      <w:r>
+        <w:t>add .</w:t>
+      </w:r>
+      <w:proofErr w:type="gramEnd"/>
     </w:p>
     <w:p>
       <w:pPr>
@@ -4124,7 +4368,23 @@
         </w:tabs>
       </w:pPr>
       <w:r>
-        <w:t xml:space="preserve">  between them and uses those patterns to predict on new data.</w:t>
+        <w:t xml:space="preserve">  between them and </w:t>
+      </w:r>
+      <w:proofErr w:type="gramStart"/>
+      <w:r>
+        <w:t>uses</w:t>
+      </w:r>
+      <w:proofErr w:type="gramEnd"/>
+      <w:r>
+        <w:t xml:space="preserve"> those patterns to </w:t>
+      </w:r>
+      <w:proofErr w:type="gramStart"/>
+      <w:r>
+        <w:t>predict on</w:t>
+      </w:r>
+      <w:proofErr w:type="gramEnd"/>
+      <w:r>
+        <w:t xml:space="preserve"> new data.</w:t>
       </w:r>
     </w:p>
     <w:p>
@@ -4209,7 +4469,15 @@
         </w:tabs>
       </w:pPr>
       <w:r>
-        <w:t xml:space="preserve">  Good actions receive rewards, bad actions receive penalties.</w:t>
+        <w:t xml:space="preserve">  Good actions receive </w:t>
+      </w:r>
+      <w:proofErr w:type="gramStart"/>
+      <w:r>
+        <w:t>rewards,</w:t>
+      </w:r>
+      <w:proofErr w:type="gramEnd"/>
+      <w:r>
+        <w:t xml:space="preserve"> bad actions receive penalties.</w:t>
       </w:r>
     </w:p>
     <w:p>
@@ -4246,8 +4514,13 @@
         </w:tabs>
       </w:pPr>
       <w:r>
-        <w:t>- Regression vs Classification: Regression predicts a continuous</w:t>
-      </w:r>
+        <w:t xml:space="preserve">- Regression vs Classification: Regression predicts </w:t>
+      </w:r>
+      <w:proofErr w:type="gramStart"/>
+      <w:r>
+        <w:t>a continuous</w:t>
+      </w:r>
+      <w:proofErr w:type="gramEnd"/>
     </w:p>
     <w:p>
       <w:pPr>
@@ -4323,7 +4596,15 @@
         </w:tabs>
       </w:pPr>
       <w:r>
-        <w:t xml:space="preserve">  answers. Directly connects to conditional statements from Day 3.</w:t>
+        <w:t xml:space="preserve">  answers. Directly </w:t>
+      </w:r>
+      <w:proofErr w:type="gramStart"/>
+      <w:r>
+        <w:t>connects</w:t>
+      </w:r>
+      <w:proofErr w:type="gramEnd"/>
+      <w:r>
+        <w:t xml:space="preserve"> to conditional statements from Day 3.</w:t>
       </w:r>
     </w:p>
     <w:p>
@@ -4431,7 +4712,15 @@
         </w:tabs>
       </w:pPr>
       <w:r>
-        <w:t xml:space="preserve">  detection, and disease risk detection. Each shows clearly</w:t>
+        <w:t xml:space="preserve">  detection, and disease risk detection. Each </w:t>
+      </w:r>
+      <w:proofErr w:type="gramStart"/>
+      <w:r>
+        <w:t>shows</w:t>
+      </w:r>
+      <w:proofErr w:type="gramEnd"/>
+      <w:r>
+        <w:t xml:space="preserve"> clearly</w:t>
       </w:r>
     </w:p>
     <w:p>
@@ -4526,7 +4815,15 @@
         </w:tabs>
       </w:pPr>
       <w:r>
-        <w:t xml:space="preserve">  how real decision trees evaluate conditions step by step.</w:t>
+        <w:t xml:space="preserve">  </w:t>
+      </w:r>
+      <w:proofErr w:type="gramStart"/>
+      <w:r>
+        <w:t>how</w:t>
+      </w:r>
+      <w:proofErr w:type="gramEnd"/>
+      <w:r>
+        <w:t xml:space="preserve"> real decision trees evaluate conditions step by step.</w:t>
       </w:r>
     </w:p>
     <w:p>
@@ -4820,7 +5117,23 @@
         </w:tabs>
       </w:pPr>
       <w:r>
-        <w:t xml:space="preserve">   learning very easy to understand</w:t>
+        <w:t xml:space="preserve">   </w:t>
+      </w:r>
+      <w:proofErr w:type="gramStart"/>
+      <w:r>
+        <w:t>learning</w:t>
+      </w:r>
+      <w:proofErr w:type="gramEnd"/>
+      <w:r>
+        <w:t xml:space="preserve"> </w:t>
+      </w:r>
+      <w:proofErr w:type="gramStart"/>
+      <w:r>
+        <w:t>very</w:t>
+      </w:r>
+      <w:proofErr w:type="gramEnd"/>
+      <w:r>
+        <w:t xml:space="preserve"> easy to understand</w:t>
       </w:r>
     </w:p>
     <w:p>
@@ -4877,7 +5190,15 @@
         </w:tabs>
       </w:pPr>
       <w:r>
-        <w:t xml:space="preserve">   the concept of overfitting explained very clearly</w:t>
+        <w:t xml:space="preserve">   </w:t>
+      </w:r>
+      <w:proofErr w:type="gramStart"/>
+      <w:r>
+        <w:t>the concept of overfitting explained</w:t>
+      </w:r>
+      <w:proofErr w:type="gramEnd"/>
+      <w:r>
+        <w:t xml:space="preserve"> very clearly</w:t>
       </w:r>
     </w:p>
     <w:p>
@@ -5128,8 +5449,13 @@
           <w:tab w:val="left" w:pos="7700"/>
         </w:tabs>
       </w:pPr>
-      <w:r>
-        <w:t>it makes the decision process fully transparent. In real world</w:t>
+      <w:proofErr w:type="gramStart"/>
+      <w:r>
+        <w:t>it</w:t>
+      </w:r>
+      <w:proofErr w:type="gramEnd"/>
+      <w:r>
+        <w:t xml:space="preserve"> makes the decision process fully transparent. In real world</w:t>
       </w:r>
     </w:p>
     <w:p>
@@ -5573,8 +5899,13 @@
         <w:t xml:space="preserve">- Slicing: Powerful feature using </w:t>
       </w:r>
       <w:proofErr w:type="spellStart"/>
-      <w:r>
-        <w:t>start:end:step</w:t>
+      <w:proofErr w:type="gramStart"/>
+      <w:r>
+        <w:t>start:end</w:t>
+      </w:r>
+      <w:proofErr w:type="gramEnd"/>
+      <w:r>
+        <w:t>:step</w:t>
       </w:r>
       <w:proofErr w:type="spellEnd"/>
       <w:r>
@@ -5588,44 +5919,92 @@
         </w:tabs>
       </w:pPr>
       <w:r>
-        <w:t xml:space="preserve">  numbers[2:5] returns items from index 2 to 4. numbers[::2]</w:t>
-      </w:r>
-    </w:p>
-    <w:p>
-      <w:pPr>
-        <w:tabs>
-          <w:tab w:val="left" w:pos="7700"/>
-        </w:tabs>
-      </w:pPr>
-      <w:r>
-        <w:t xml:space="preserve">  returns every second item. numbers[::-1] reverses the list.</w:t>
-      </w:r>
-    </w:p>
-    <w:p>
-      <w:pPr>
-        <w:tabs>
-          <w:tab w:val="left" w:pos="7700"/>
-        </w:tabs>
-      </w:pPr>
-    </w:p>
-    <w:p>
-      <w:pPr>
-        <w:tabs>
-          <w:tab w:val="left" w:pos="7700"/>
-        </w:tabs>
-      </w:pPr>
-      <w:r>
-        <w:t>- Adding Items: append() adds one item at the end. insert()</w:t>
-      </w:r>
-    </w:p>
-    <w:p>
-      <w:pPr>
-        <w:tabs>
-          <w:tab w:val="left" w:pos="7700"/>
-        </w:tabs>
-      </w:pPr>
-      <w:r>
-        <w:t xml:space="preserve">  adds at a specific position. extend() adds all items from</w:t>
+        <w:t xml:space="preserve">  </w:t>
+      </w:r>
+      <w:proofErr w:type="gramStart"/>
+      <w:r>
+        <w:t>numbers[</w:t>
+      </w:r>
+      <w:proofErr w:type="gramEnd"/>
+      <w:r>
+        <w:t>2:5] returns items from index 2 to 4. numbers</w:t>
+      </w:r>
+      <w:proofErr w:type="gramStart"/>
+      <w:r>
+        <w:t>[::</w:t>
+      </w:r>
+      <w:proofErr w:type="gramEnd"/>
+      <w:r>
+        <w:t>2]</w:t>
+      </w:r>
+    </w:p>
+    <w:p>
+      <w:pPr>
+        <w:tabs>
+          <w:tab w:val="left" w:pos="7700"/>
+        </w:tabs>
+      </w:pPr>
+      <w:r>
+        <w:t xml:space="preserve">  returns every second item. numbers</w:t>
+      </w:r>
+      <w:proofErr w:type="gramStart"/>
+      <w:r>
+        <w:t>[::</w:t>
+      </w:r>
+      <w:proofErr w:type="gramEnd"/>
+      <w:r>
+        <w:t>-1] reverses the list.</w:t>
+      </w:r>
+    </w:p>
+    <w:p>
+      <w:pPr>
+        <w:tabs>
+          <w:tab w:val="left" w:pos="7700"/>
+        </w:tabs>
+      </w:pPr>
+    </w:p>
+    <w:p>
+      <w:pPr>
+        <w:tabs>
+          <w:tab w:val="left" w:pos="7700"/>
+        </w:tabs>
+      </w:pPr>
+      <w:r>
+        <w:t xml:space="preserve">- Adding Items: </w:t>
+      </w:r>
+      <w:proofErr w:type="gramStart"/>
+      <w:r>
+        <w:t>append(</w:t>
+      </w:r>
+      <w:proofErr w:type="gramEnd"/>
+      <w:r>
+        <w:t xml:space="preserve">) adds one item at the end. </w:t>
+      </w:r>
+      <w:proofErr w:type="gramStart"/>
+      <w:r>
+        <w:t>insert(</w:t>
+      </w:r>
+      <w:proofErr w:type="gramEnd"/>
+      <w:r>
+        <w:t>)</w:t>
+      </w:r>
+    </w:p>
+    <w:p>
+      <w:pPr>
+        <w:tabs>
+          <w:tab w:val="left" w:pos="7700"/>
+        </w:tabs>
+      </w:pPr>
+      <w:r>
+        <w:t xml:space="preserve">  adds at a specific position. </w:t>
+      </w:r>
+      <w:proofErr w:type="gramStart"/>
+      <w:r>
+        <w:t>extend(</w:t>
+      </w:r>
+      <w:proofErr w:type="gramEnd"/>
+      <w:r>
+        <w:t>) adds all items from</w:t>
       </w:r>
     </w:p>
     <w:p>
@@ -5652,263 +6031,15 @@
         </w:tabs>
       </w:pPr>
       <w:r>
-        <w:t>- Removing Items: remove() deletes first occurrence of a value.</w:t>
-      </w:r>
-    </w:p>
-    <w:p>
-      <w:pPr>
-        <w:tabs>
-          <w:tab w:val="left" w:pos="7700"/>
-        </w:tabs>
-      </w:pPr>
-      <w:r>
-        <w:lastRenderedPageBreak/>
-        <w:t xml:space="preserve">  pop() removes and returns item at given index. clear()</w:t>
-      </w:r>
-    </w:p>
-    <w:p>
-      <w:pPr>
-        <w:tabs>
-          <w:tab w:val="left" w:pos="7700"/>
-        </w:tabs>
-      </w:pPr>
-      <w:r>
-        <w:t xml:space="preserve">  removes everything from the list.</w:t>
-      </w:r>
-    </w:p>
-    <w:p>
-      <w:pPr>
-        <w:tabs>
-          <w:tab w:val="left" w:pos="7700"/>
-        </w:tabs>
-      </w:pPr>
-    </w:p>
-    <w:p>
-      <w:pPr>
-        <w:tabs>
-          <w:tab w:val="left" w:pos="7700"/>
-        </w:tabs>
-      </w:pPr>
-      <w:r>
-        <w:t>- List Methods: sort() sorts in place. sorted() returns a new</w:t>
-      </w:r>
-    </w:p>
-    <w:p>
-      <w:pPr>
-        <w:tabs>
-          <w:tab w:val="left" w:pos="7700"/>
-        </w:tabs>
-      </w:pPr>
-      <w:r>
-        <w:t xml:space="preserve">  sorted list without changing the original. reverse() reverses</w:t>
-      </w:r>
-    </w:p>
-    <w:p>
-      <w:pPr>
-        <w:tabs>
-          <w:tab w:val="left" w:pos="7700"/>
-        </w:tabs>
-      </w:pPr>
-      <w:r>
-        <w:t xml:space="preserve">  in place. count() counts occurrences. index() finds position.</w:t>
-      </w:r>
-    </w:p>
-    <w:p>
-      <w:pPr>
-        <w:tabs>
-          <w:tab w:val="left" w:pos="7700"/>
-        </w:tabs>
-      </w:pPr>
-    </w:p>
-    <w:p>
-      <w:pPr>
-        <w:tabs>
-          <w:tab w:val="left" w:pos="7700"/>
-        </w:tabs>
-      </w:pPr>
-      <w:r>
-        <w:t>- List Comprehension: Clean one-line syntax for creating lists.</w:t>
-      </w:r>
-    </w:p>
-    <w:p>
-      <w:pPr>
-        <w:tabs>
-          <w:tab w:val="left" w:pos="7700"/>
-        </w:tabs>
-      </w:pPr>
-      <w:r>
-        <w:t xml:space="preserve">  [x**2 for x in range(5)] creates a list of squares. Filters</w:t>
-      </w:r>
-    </w:p>
-    <w:p>
-      <w:pPr>
-        <w:tabs>
-          <w:tab w:val="left" w:pos="7700"/>
-        </w:tabs>
-      </w:pPr>
-      <w:r>
-        <w:t xml:space="preserve">  can also be added like [x for x in marks if x &gt;= 50].</w:t>
-      </w:r>
-    </w:p>
-    <w:p>
-      <w:pPr>
-        <w:tabs>
-          <w:tab w:val="left" w:pos="7700"/>
-        </w:tabs>
-      </w:pPr>
-    </w:p>
-    <w:p>
-      <w:pPr>
-        <w:tabs>
-          <w:tab w:val="left" w:pos="7700"/>
-        </w:tabs>
-      </w:pPr>
-      <w:r>
-        <w:t xml:space="preserve">- Error Handling: </w:t>
-      </w:r>
-      <w:proofErr w:type="spellStart"/>
-      <w:r>
-        <w:t>IndexError</w:t>
-      </w:r>
-      <w:proofErr w:type="spellEnd"/>
-      <w:r>
-        <w:t xml:space="preserve"> occurs when accessing an index</w:t>
-      </w:r>
-    </w:p>
-    <w:p>
-      <w:pPr>
-        <w:tabs>
-          <w:tab w:val="left" w:pos="7700"/>
-        </w:tabs>
-      </w:pPr>
-      <w:r>
-        <w:t xml:space="preserve">  that does not exist. </w:t>
-      </w:r>
-      <w:proofErr w:type="spellStart"/>
-      <w:r>
-        <w:t>ValueError</w:t>
-      </w:r>
-      <w:proofErr w:type="spellEnd"/>
-      <w:r>
-        <w:t xml:space="preserve"> occurs when removing a value</w:t>
-      </w:r>
-    </w:p>
-    <w:p>
-      <w:pPr>
-        <w:tabs>
-          <w:tab w:val="left" w:pos="7700"/>
-        </w:tabs>
-      </w:pPr>
-      <w:r>
-        <w:t xml:space="preserve">  that is not in the list. Both handled with try-except blocks.</w:t>
-      </w:r>
-    </w:p>
-    <w:p>
-      <w:pPr>
-        <w:tabs>
-          <w:tab w:val="left" w:pos="7700"/>
-        </w:tabs>
-      </w:pPr>
-    </w:p>
-    <w:p>
-      <w:pPr>
-        <w:tabs>
-          <w:tab w:val="left" w:pos="7700"/>
-        </w:tabs>
-      </w:pPr>
-      <w:r>
-        <w:t>---</w:t>
-      </w:r>
-    </w:p>
-    <w:p>
-      <w:pPr>
-        <w:tabs>
-          <w:tab w:val="left" w:pos="7700"/>
-        </w:tabs>
-      </w:pPr>
-    </w:p>
-    <w:p>
-      <w:pPr>
-        <w:tabs>
-          <w:tab w:val="left" w:pos="7700"/>
-        </w:tabs>
-      </w:pPr>
-      <w:r>
-        <w:t>What I Built (Practical Implementations):</w:t>
-      </w:r>
-    </w:p>
-    <w:p>
-      <w:pPr>
-        <w:tabs>
-          <w:tab w:val="left" w:pos="7700"/>
-        </w:tabs>
-      </w:pPr>
-    </w:p>
-    <w:p>
-      <w:pPr>
-        <w:tabs>
-          <w:tab w:val="left" w:pos="7700"/>
-        </w:tabs>
-      </w:pPr>
-      <w:r>
-        <w:t>- list_basics.py — Demonstrated all fundamental list operations</w:t>
-      </w:r>
-    </w:p>
-    <w:p>
-      <w:pPr>
-        <w:tabs>
-          <w:tab w:val="left" w:pos="7700"/>
-        </w:tabs>
-      </w:pPr>
-      <w:r>
-        <w:t xml:space="preserve">  including creation, positive and negative indexing, basic and</w:t>
-      </w:r>
-    </w:p>
-    <w:p>
-      <w:pPr>
-        <w:tabs>
-          <w:tab w:val="left" w:pos="7700"/>
-        </w:tabs>
-      </w:pPr>
-      <w:r>
-        <w:t xml:space="preserve">  step slicing, adding items with append/insert/extend, removing</w:t>
-      </w:r>
-    </w:p>
-    <w:p>
-      <w:pPr>
-        <w:tabs>
-          <w:tab w:val="left" w:pos="7700"/>
-        </w:tabs>
-      </w:pPr>
-      <w:r>
-        <w:t xml:space="preserve">  items with remove/pop/clear, and all list methods.</w:t>
-      </w:r>
-    </w:p>
-    <w:p>
-      <w:pPr>
-        <w:tabs>
-          <w:tab w:val="left" w:pos="7700"/>
-        </w:tabs>
-      </w:pPr>
-    </w:p>
-    <w:p>
-      <w:pPr>
-        <w:tabs>
-          <w:tab w:val="left" w:pos="7700"/>
-        </w:tabs>
-      </w:pPr>
-      <w:r>
-        <w:t>- list_operations.py — Advanced operations including sort() vs</w:t>
-      </w:r>
-    </w:p>
-    <w:p>
-      <w:pPr>
-        <w:tabs>
-          <w:tab w:val="left" w:pos="7700"/>
-        </w:tabs>
-      </w:pPr>
-      <w:r>
-        <w:t xml:space="preserve">  sorted() comparison, linear search, in operator, index method,</w:t>
+        <w:t xml:space="preserve">- Removing Items: </w:t>
+      </w:r>
+      <w:proofErr w:type="gramStart"/>
+      <w:r>
+        <w:t>remove(</w:t>
+      </w:r>
+      <w:proofErr w:type="gramEnd"/>
+      <w:r>
+        <w:t>) deletes first occurrence of a value.</w:t>
       </w:r>
     </w:p>
     <w:p>
@@ -5921,12 +6052,364 @@
         <w:lastRenderedPageBreak/>
         <w:t xml:space="preserve">  </w:t>
       </w:r>
+      <w:proofErr w:type="gramStart"/>
+      <w:r>
+        <w:t>pop(</w:t>
+      </w:r>
+      <w:proofErr w:type="gramEnd"/>
+      <w:r>
+        <w:t xml:space="preserve">) removes and returns </w:t>
+      </w:r>
+      <w:proofErr w:type="gramStart"/>
+      <w:r>
+        <w:t>item</w:t>
+      </w:r>
+      <w:proofErr w:type="gramEnd"/>
+      <w:r>
+        <w:t xml:space="preserve"> at given index. </w:t>
+      </w:r>
+      <w:proofErr w:type="gramStart"/>
+      <w:r>
+        <w:t>clear(</w:t>
+      </w:r>
+      <w:proofErr w:type="gramEnd"/>
+      <w:r>
+        <w:t>)</w:t>
+      </w:r>
+    </w:p>
+    <w:p>
+      <w:pPr>
+        <w:tabs>
+          <w:tab w:val="left" w:pos="7700"/>
+        </w:tabs>
+      </w:pPr>
+      <w:r>
+        <w:t xml:space="preserve">  removes everything from the list.</w:t>
+      </w:r>
+    </w:p>
+    <w:p>
+      <w:pPr>
+        <w:tabs>
+          <w:tab w:val="left" w:pos="7700"/>
+        </w:tabs>
+      </w:pPr>
+    </w:p>
+    <w:p>
+      <w:pPr>
+        <w:tabs>
+          <w:tab w:val="left" w:pos="7700"/>
+        </w:tabs>
+      </w:pPr>
+      <w:r>
+        <w:t xml:space="preserve">- List Methods: </w:t>
+      </w:r>
+      <w:proofErr w:type="gramStart"/>
+      <w:r>
+        <w:t>sort(</w:t>
+      </w:r>
+      <w:proofErr w:type="gramEnd"/>
+      <w:r>
+        <w:t xml:space="preserve">) sorts in place. </w:t>
+      </w:r>
+      <w:proofErr w:type="gramStart"/>
+      <w:r>
+        <w:t>sorted(</w:t>
+      </w:r>
+      <w:proofErr w:type="gramEnd"/>
+      <w:r>
+        <w:t>) returns a new</w:t>
+      </w:r>
+    </w:p>
+    <w:p>
+      <w:pPr>
+        <w:tabs>
+          <w:tab w:val="left" w:pos="7700"/>
+        </w:tabs>
+      </w:pPr>
+      <w:r>
+        <w:t xml:space="preserve">  sorted list without changing the original. </w:t>
+      </w:r>
+      <w:proofErr w:type="gramStart"/>
+      <w:r>
+        <w:t>reverse(</w:t>
+      </w:r>
+      <w:proofErr w:type="gramEnd"/>
+      <w:r>
+        <w:t>) reverses</w:t>
+      </w:r>
+    </w:p>
+    <w:p>
+      <w:pPr>
+        <w:tabs>
+          <w:tab w:val="left" w:pos="7700"/>
+        </w:tabs>
+      </w:pPr>
+      <w:r>
+        <w:t xml:space="preserve">  in place. </w:t>
+      </w:r>
+      <w:proofErr w:type="gramStart"/>
+      <w:r>
+        <w:t>count(</w:t>
+      </w:r>
+      <w:proofErr w:type="gramEnd"/>
+      <w:r>
+        <w:t xml:space="preserve">) counts occurrences. </w:t>
+      </w:r>
+      <w:proofErr w:type="gramStart"/>
+      <w:r>
+        <w:t>index(</w:t>
+      </w:r>
+      <w:proofErr w:type="gramEnd"/>
+      <w:r>
+        <w:t>) finds position.</w:t>
+      </w:r>
+    </w:p>
+    <w:p>
+      <w:pPr>
+        <w:tabs>
+          <w:tab w:val="left" w:pos="7700"/>
+        </w:tabs>
+      </w:pPr>
+    </w:p>
+    <w:p>
+      <w:pPr>
+        <w:tabs>
+          <w:tab w:val="left" w:pos="7700"/>
+        </w:tabs>
+      </w:pPr>
+      <w:r>
+        <w:t>- List Comprehension: Clean one-line syntax for creating lists.</w:t>
+      </w:r>
+    </w:p>
+    <w:p>
+      <w:pPr>
+        <w:tabs>
+          <w:tab w:val="left" w:pos="7700"/>
+        </w:tabs>
+      </w:pPr>
+      <w:r>
+        <w:t xml:space="preserve">  [x**2 for x in </w:t>
+      </w:r>
+      <w:proofErr w:type="gramStart"/>
+      <w:r>
+        <w:t>range(</w:t>
+      </w:r>
+      <w:proofErr w:type="gramEnd"/>
+      <w:r>
+        <w:t>5)] creates a list of squares. Filters</w:t>
+      </w:r>
+    </w:p>
+    <w:p>
+      <w:pPr>
+        <w:tabs>
+          <w:tab w:val="left" w:pos="7700"/>
+        </w:tabs>
+      </w:pPr>
+      <w:r>
+        <w:t xml:space="preserve">  can also be added like [x for x in marks if x &gt;= 50].</w:t>
+      </w:r>
+    </w:p>
+    <w:p>
+      <w:pPr>
+        <w:tabs>
+          <w:tab w:val="left" w:pos="7700"/>
+        </w:tabs>
+      </w:pPr>
+    </w:p>
+    <w:p>
+      <w:pPr>
+        <w:tabs>
+          <w:tab w:val="left" w:pos="7700"/>
+        </w:tabs>
+      </w:pPr>
+      <w:r>
+        <w:t xml:space="preserve">- Error Handling: </w:t>
+      </w:r>
       <w:proofErr w:type="spellStart"/>
       <w:r>
         <w:t>IndexError</w:t>
       </w:r>
       <w:proofErr w:type="spellEnd"/>
       <w:r>
+        <w:t xml:space="preserve"> occurs when accessing an index</w:t>
+      </w:r>
+    </w:p>
+    <w:p>
+      <w:pPr>
+        <w:tabs>
+          <w:tab w:val="left" w:pos="7700"/>
+        </w:tabs>
+      </w:pPr>
+      <w:r>
+        <w:t xml:space="preserve">  that does not exist. </w:t>
+      </w:r>
+      <w:proofErr w:type="spellStart"/>
+      <w:r>
+        <w:t>ValueError</w:t>
+      </w:r>
+      <w:proofErr w:type="spellEnd"/>
+      <w:r>
+        <w:t xml:space="preserve"> occurs when removing a value</w:t>
+      </w:r>
+    </w:p>
+    <w:p>
+      <w:pPr>
+        <w:tabs>
+          <w:tab w:val="left" w:pos="7700"/>
+        </w:tabs>
+      </w:pPr>
+      <w:r>
+        <w:t xml:space="preserve">  that is not </w:t>
+      </w:r>
+      <w:proofErr w:type="gramStart"/>
+      <w:r>
+        <w:t>in</w:t>
+      </w:r>
+      <w:proofErr w:type="gramEnd"/>
+      <w:r>
+        <w:t xml:space="preserve"> the list. Both handled with try-except blocks.</w:t>
+      </w:r>
+    </w:p>
+    <w:p>
+      <w:pPr>
+        <w:tabs>
+          <w:tab w:val="left" w:pos="7700"/>
+        </w:tabs>
+      </w:pPr>
+    </w:p>
+    <w:p>
+      <w:pPr>
+        <w:tabs>
+          <w:tab w:val="left" w:pos="7700"/>
+        </w:tabs>
+      </w:pPr>
+      <w:r>
+        <w:t>---</w:t>
+      </w:r>
+    </w:p>
+    <w:p>
+      <w:pPr>
+        <w:tabs>
+          <w:tab w:val="left" w:pos="7700"/>
+        </w:tabs>
+      </w:pPr>
+    </w:p>
+    <w:p>
+      <w:pPr>
+        <w:tabs>
+          <w:tab w:val="left" w:pos="7700"/>
+        </w:tabs>
+      </w:pPr>
+      <w:r>
+        <w:t>What I Built (Practical Implementations):</w:t>
+      </w:r>
+    </w:p>
+    <w:p>
+      <w:pPr>
+        <w:tabs>
+          <w:tab w:val="left" w:pos="7700"/>
+        </w:tabs>
+      </w:pPr>
+    </w:p>
+    <w:p>
+      <w:pPr>
+        <w:tabs>
+          <w:tab w:val="left" w:pos="7700"/>
+        </w:tabs>
+      </w:pPr>
+      <w:r>
+        <w:t>- list_basics.py — Demonstrated all fundamental list operations</w:t>
+      </w:r>
+    </w:p>
+    <w:p>
+      <w:pPr>
+        <w:tabs>
+          <w:tab w:val="left" w:pos="7700"/>
+        </w:tabs>
+      </w:pPr>
+      <w:r>
+        <w:t xml:space="preserve">  including creation, positive and negative indexing, basic and</w:t>
+      </w:r>
+    </w:p>
+    <w:p>
+      <w:pPr>
+        <w:tabs>
+          <w:tab w:val="left" w:pos="7700"/>
+        </w:tabs>
+      </w:pPr>
+      <w:r>
+        <w:t xml:space="preserve">  step slicing, adding items with append/insert/extend, removing</w:t>
+      </w:r>
+    </w:p>
+    <w:p>
+      <w:pPr>
+        <w:tabs>
+          <w:tab w:val="left" w:pos="7700"/>
+        </w:tabs>
+      </w:pPr>
+      <w:r>
+        <w:t xml:space="preserve">  items with remove/pop/clear, and all list methods.</w:t>
+      </w:r>
+    </w:p>
+    <w:p>
+      <w:pPr>
+        <w:tabs>
+          <w:tab w:val="left" w:pos="7700"/>
+        </w:tabs>
+      </w:pPr>
+    </w:p>
+    <w:p>
+      <w:pPr>
+        <w:tabs>
+          <w:tab w:val="left" w:pos="7700"/>
+        </w:tabs>
+      </w:pPr>
+      <w:r>
+        <w:t xml:space="preserve">- list_operations.py — Advanced operations including </w:t>
+      </w:r>
+      <w:proofErr w:type="gramStart"/>
+      <w:r>
+        <w:t>sort(</w:t>
+      </w:r>
+      <w:proofErr w:type="gramEnd"/>
+      <w:r>
+        <w:t>) vs</w:t>
+      </w:r>
+    </w:p>
+    <w:p>
+      <w:pPr>
+        <w:tabs>
+          <w:tab w:val="left" w:pos="7700"/>
+        </w:tabs>
+      </w:pPr>
+      <w:r>
+        <w:t xml:space="preserve">  </w:t>
+      </w:r>
+      <w:proofErr w:type="gramStart"/>
+      <w:r>
+        <w:t>sorted(</w:t>
+      </w:r>
+      <w:proofErr w:type="gramEnd"/>
+      <w:r>
+        <w:t>) comparison, linear search, in operator, index method,</w:t>
+      </w:r>
+    </w:p>
+    <w:p>
+      <w:pPr>
+        <w:tabs>
+          <w:tab w:val="left" w:pos="7700"/>
+        </w:tabs>
+      </w:pPr>
+      <w:r>
+        <w:lastRenderedPageBreak/>
+        <w:t xml:space="preserve">  </w:t>
+      </w:r>
+      <w:proofErr w:type="spellStart"/>
+      <w:r>
+        <w:t>IndexError</w:t>
+      </w:r>
+      <w:proofErr w:type="spellEnd"/>
+      <w:r>
         <w:t xml:space="preserve"> and </w:t>
       </w:r>
       <w:proofErr w:type="spellStart"/>
@@ -5939,11 +6422,19 @@
       </w:r>
       <w:proofErr w:type="spellStart"/>
       <w:r>
-        <w:t>safe_get</w:t>
+        <w:t>safe_</w:t>
+      </w:r>
+      <w:proofErr w:type="gramStart"/>
+      <w:r>
+        <w:t>get</w:t>
       </w:r>
       <w:proofErr w:type="spellEnd"/>
       <w:r>
-        <w:t>() function for</w:t>
+        <w:t>(</w:t>
+      </w:r>
+      <w:proofErr w:type="gramEnd"/>
+      <w:r>
+        <w:t>) function for</w:t>
       </w:r>
     </w:p>
     <w:p>
@@ -6608,24 +7099,40 @@
         </w:tabs>
       </w:pPr>
       <w:r>
-        <w:t xml:space="preserve">  when should I use each one?</w:t>
-      </w:r>
-    </w:p>
-    <w:p>
-      <w:pPr>
-        <w:tabs>
-          <w:tab w:val="left" w:pos="7700"/>
-        </w:tabs>
-      </w:pPr>
-    </w:p>
-    <w:p>
-      <w:pPr>
-        <w:tabs>
-          <w:tab w:val="left" w:pos="7700"/>
-        </w:tabs>
-      </w:pPr>
-      <w:r>
-        <w:t>- Are list comprehensions always faster than regular for</w:t>
+        <w:t xml:space="preserve">  </w:t>
+      </w:r>
+      <w:proofErr w:type="gramStart"/>
+      <w:r>
+        <w:t>when</w:t>
+      </w:r>
+      <w:proofErr w:type="gramEnd"/>
+      <w:r>
+        <w:t xml:space="preserve"> should I use each one?</w:t>
+      </w:r>
+    </w:p>
+    <w:p>
+      <w:pPr>
+        <w:tabs>
+          <w:tab w:val="left" w:pos="7700"/>
+        </w:tabs>
+      </w:pPr>
+    </w:p>
+    <w:p>
+      <w:pPr>
+        <w:tabs>
+          <w:tab w:val="left" w:pos="7700"/>
+        </w:tabs>
+      </w:pPr>
+      <w:r>
+        <w:t xml:space="preserve">- Are list </w:t>
+      </w:r>
+      <w:proofErr w:type="gramStart"/>
+      <w:r>
+        <w:t>comprehensions</w:t>
+      </w:r>
+      <w:proofErr w:type="gramEnd"/>
+      <w:r>
+        <w:t xml:space="preserve"> always faster than regular for</w:t>
       </w:r>
     </w:p>
     <w:p>
@@ -6722,11 +7229,1258 @@
     </w:p>
     <w:p>
       <w:pPr>
-        <w:pStyle w:val="ListParagraph"/>
-        <w:tabs>
-          <w:tab w:val="left" w:pos="7700"/>
-        </w:tabs>
-      </w:pPr>
+        <w:tabs>
+          <w:tab w:val="left" w:pos="7700"/>
+        </w:tabs>
+      </w:pPr>
+    </w:p>
+    <w:p>
+      <w:pPr>
+        <w:tabs>
+          <w:tab w:val="left" w:pos="7700"/>
+        </w:tabs>
+      </w:pPr>
+    </w:p>
+    <w:p>
+      <w:pPr>
+        <w:tabs>
+          <w:tab w:val="left" w:pos="7700"/>
+        </w:tabs>
+      </w:pPr>
+    </w:p>
+    <w:p>
+      <w:pPr>
+        <w:tabs>
+          <w:tab w:val="left" w:pos="7700"/>
+        </w:tabs>
+      </w:pPr>
+    </w:p>
+    <w:p>
+      <w:pPr>
+        <w:tabs>
+          <w:tab w:val="left" w:pos="7700"/>
+        </w:tabs>
+      </w:pPr>
+    </w:p>
+    <w:p>
+      <w:pPr>
+        <w:tabs>
+          <w:tab w:val="left" w:pos="7700"/>
+        </w:tabs>
+      </w:pPr>
+    </w:p>
+    <w:p>
+      <w:pPr>
+        <w:tabs>
+          <w:tab w:val="left" w:pos="7700"/>
+        </w:tabs>
+      </w:pPr>
+    </w:p>
+    <w:p>
+      <w:pPr>
+        <w:tabs>
+          <w:tab w:val="left" w:pos="7700"/>
+        </w:tabs>
+      </w:pPr>
+    </w:p>
+    <w:p>
+      <w:pPr>
+        <w:tabs>
+          <w:tab w:val="left" w:pos="7700"/>
+        </w:tabs>
+      </w:pPr>
+      <w:r>
+        <w:t>Complete email for day 05 and day 06</w:t>
+      </w:r>
+      <w:r>
+        <w:t xml:space="preserve"> and 7</w:t>
+      </w:r>
+      <w:r>
+        <w:t xml:space="preserve"> </w:t>
+      </w:r>
+      <w:proofErr w:type="gramStart"/>
+      <w:r>
+        <w:t>work :</w:t>
+      </w:r>
+      <w:proofErr w:type="gramEnd"/>
+    </w:p>
+    <w:p>
+      <w:pPr>
+        <w:tabs>
+          <w:tab w:val="left" w:pos="7700"/>
+        </w:tabs>
+      </w:pPr>
+      <w:r>
+        <w:t>Subject: [Day 5, 6 &amp; 7] Sehar Andleeb - Daily Progress Report</w:t>
+      </w:r>
+    </w:p>
+    <w:p>
+      <w:pPr>
+        <w:tabs>
+          <w:tab w:val="left" w:pos="7700"/>
+        </w:tabs>
+      </w:pPr>
+    </w:p>
+    <w:p>
+      <w:pPr>
+        <w:tabs>
+          <w:tab w:val="left" w:pos="7700"/>
+        </w:tabs>
+      </w:pPr>
+      <w:r>
+        <w:t>Dear Mubashir Sir,</w:t>
+      </w:r>
+    </w:p>
+    <w:p>
+      <w:pPr>
+        <w:tabs>
+          <w:tab w:val="left" w:pos="7700"/>
+        </w:tabs>
+      </w:pPr>
+    </w:p>
+    <w:p>
+      <w:pPr>
+        <w:tabs>
+          <w:tab w:val="left" w:pos="7700"/>
+        </w:tabs>
+      </w:pPr>
+      <w:r>
+        <w:t>Here is my combined progress report for Day 5, Day 6, and Day 7 of the AI Engineer Internship — all completed on June 10, 2026.</w:t>
+      </w:r>
+    </w:p>
+    <w:p>
+      <w:pPr>
+        <w:tabs>
+          <w:tab w:val="left" w:pos="7700"/>
+        </w:tabs>
+      </w:pPr>
+    </w:p>
+    <w:p>
+      <w:pPr>
+        <w:tabs>
+          <w:tab w:val="left" w:pos="7700"/>
+        </w:tabs>
+      </w:pPr>
+      <w:r>
+        <w:t>─────────────────────────────────────────</w:t>
+      </w:r>
+    </w:p>
+    <w:p>
+      <w:pPr>
+        <w:tabs>
+          <w:tab w:val="left" w:pos="7700"/>
+        </w:tabs>
+      </w:pPr>
+      <w:r>
+        <w:t>What I Learned (Theoretical Concepts):</w:t>
+      </w:r>
+    </w:p>
+    <w:p>
+      <w:pPr>
+        <w:tabs>
+          <w:tab w:val="left" w:pos="7700"/>
+        </w:tabs>
+      </w:pPr>
+      <w:r>
+        <w:t>─────────────────────────────────────────</w:t>
+      </w:r>
+    </w:p>
+    <w:p>
+      <w:pPr>
+        <w:tabs>
+          <w:tab w:val="left" w:pos="7700"/>
+        </w:tabs>
+      </w:pPr>
+    </w:p>
+    <w:p>
+      <w:pPr>
+        <w:tabs>
+          <w:tab w:val="left" w:pos="7700"/>
+        </w:tabs>
+      </w:pPr>
+      <w:r>
+        <w:lastRenderedPageBreak/>
+        <w:t>• Supervised, Unsupervised &amp; Reinforcement Learning: Three core ML paradigms — labeled data prediction, hidden pattern discovery, and reward-based agent learning respectively.</w:t>
+      </w:r>
+    </w:p>
+    <w:p>
+      <w:pPr>
+        <w:tabs>
+          <w:tab w:val="left" w:pos="7700"/>
+        </w:tabs>
+      </w:pPr>
+    </w:p>
+    <w:p>
+      <w:pPr>
+        <w:tabs>
+          <w:tab w:val="left" w:pos="7700"/>
+        </w:tabs>
+      </w:pPr>
+      <w:r>
+        <w:t>• Regression vs Classification: Regression predicts continuous values (house price); classification predicts discrete categories (spam/not spam). This distinction determines algorithm selection for any ML problem.</w:t>
+      </w:r>
+    </w:p>
+    <w:p>
+      <w:pPr>
+        <w:tabs>
+          <w:tab w:val="left" w:pos="7700"/>
+        </w:tabs>
+      </w:pPr>
+    </w:p>
+    <w:p>
+      <w:pPr>
+        <w:tabs>
+          <w:tab w:val="left" w:pos="7700"/>
+        </w:tabs>
+      </w:pPr>
+      <w:r>
+        <w:t>• Decision Trees: Flowchart-based structures mapping directly to if-</w:t>
+      </w:r>
+      <w:proofErr w:type="spellStart"/>
+      <w:r>
+        <w:t>elif</w:t>
+      </w:r>
+      <w:proofErr w:type="spellEnd"/>
+      <w:r>
+        <w:t>-else logic. Explainability at each node is a critical real-world AI engineering skill.</w:t>
+      </w:r>
+    </w:p>
+    <w:p>
+      <w:pPr>
+        <w:tabs>
+          <w:tab w:val="left" w:pos="7700"/>
+        </w:tabs>
+      </w:pPr>
+    </w:p>
+    <w:p>
+      <w:pPr>
+        <w:tabs>
+          <w:tab w:val="left" w:pos="7700"/>
+        </w:tabs>
+      </w:pPr>
+      <w:r>
+        <w:t xml:space="preserve">• Python Lists: Ordered mutable collections with </w:t>
+      </w:r>
+      <w:proofErr w:type="gramStart"/>
+      <w:r>
+        <w:t>O(</w:t>
+      </w:r>
+      <w:proofErr w:type="gramEnd"/>
+      <w:r>
+        <w:t>1) append vs O(n) insert. Slicing, list comprehension, and error handling (</w:t>
+      </w:r>
+      <w:proofErr w:type="spellStart"/>
+      <w:r>
+        <w:t>IndexError</w:t>
+      </w:r>
+      <w:proofErr w:type="spellEnd"/>
+      <w:r>
+        <w:t xml:space="preserve">, </w:t>
+      </w:r>
+      <w:proofErr w:type="spellStart"/>
+      <w:r>
+        <w:t>ValueError</w:t>
+      </w:r>
+      <w:proofErr w:type="spellEnd"/>
+      <w:r>
+        <w:t>) covered in depth.</w:t>
+      </w:r>
+    </w:p>
+    <w:p>
+      <w:pPr>
+        <w:tabs>
+          <w:tab w:val="left" w:pos="7700"/>
+        </w:tabs>
+      </w:pPr>
+    </w:p>
+    <w:p>
+      <w:pPr>
+        <w:tabs>
+          <w:tab w:val="left" w:pos="7700"/>
+        </w:tabs>
+      </w:pPr>
+      <w:r>
+        <w:t>• Explainable AI: Printing decision paths at each node makes model behavior transparent — as important as the decision itself in production systems.</w:t>
+      </w:r>
+    </w:p>
+    <w:p>
+      <w:pPr>
+        <w:tabs>
+          <w:tab w:val="left" w:pos="7700"/>
+        </w:tabs>
+      </w:pPr>
+    </w:p>
+    <w:p>
+      <w:pPr>
+        <w:tabs>
+          <w:tab w:val="left" w:pos="7700"/>
+        </w:tabs>
+      </w:pPr>
+      <w:r>
+        <w:t>─────────────────────────────────────────</w:t>
+      </w:r>
+    </w:p>
+    <w:p>
+      <w:pPr>
+        <w:tabs>
+          <w:tab w:val="left" w:pos="7700"/>
+        </w:tabs>
+      </w:pPr>
+      <w:r>
+        <w:t>What I Built (Practical Implementations):</w:t>
+      </w:r>
+    </w:p>
+    <w:p>
+      <w:pPr>
+        <w:tabs>
+          <w:tab w:val="left" w:pos="7700"/>
+        </w:tabs>
+      </w:pPr>
+      <w:r>
+        <w:t>─────────────────────────────────────────</w:t>
+      </w:r>
+    </w:p>
+    <w:p>
+      <w:pPr>
+        <w:tabs>
+          <w:tab w:val="left" w:pos="7700"/>
+        </w:tabs>
+      </w:pPr>
+    </w:p>
+    <w:p>
+      <w:pPr>
+        <w:tabs>
+          <w:tab w:val="left" w:pos="7700"/>
+        </w:tabs>
+      </w:pPr>
+      <w:r>
+        <w:t>• decision_tree.py — Loan approval and medical diagnosis trees with visual terminal output and full edge case handling.</w:t>
+      </w:r>
+    </w:p>
+    <w:p>
+      <w:pPr>
+        <w:tabs>
+          <w:tab w:val="left" w:pos="7700"/>
+        </w:tabs>
+      </w:pPr>
+    </w:p>
+    <w:p>
+      <w:pPr>
+        <w:tabs>
+          <w:tab w:val="left" w:pos="7700"/>
+        </w:tabs>
+      </w:pPr>
+      <w:r>
+        <w:t>• regression_vs_classification.py — Four programs: house price predictor, temperature predictor, spam detector, disease risk detector.</w:t>
+      </w:r>
+    </w:p>
+    <w:p>
+      <w:pPr>
+        <w:tabs>
+          <w:tab w:val="left" w:pos="7700"/>
+        </w:tabs>
+      </w:pPr>
+    </w:p>
+    <w:p>
+      <w:pPr>
+        <w:tabs>
+          <w:tab w:val="left" w:pos="7700"/>
+        </w:tabs>
+      </w:pPr>
+      <w:r>
+        <w:t>• ml_concepts.py — Interactive ML explorer simulating all three learning types with real training data and reward/penalty logic.</w:t>
+      </w:r>
+    </w:p>
+    <w:p>
+      <w:pPr>
+        <w:tabs>
+          <w:tab w:val="left" w:pos="7700"/>
+        </w:tabs>
+      </w:pPr>
+    </w:p>
+    <w:p>
+      <w:pPr>
+        <w:tabs>
+          <w:tab w:val="left" w:pos="7700"/>
+        </w:tabs>
+      </w:pPr>
+      <w:r>
+        <w:t>• decision_tree_simulator.py — Transparent loan approval tree printing exact decision path at every node.</w:t>
+      </w:r>
+    </w:p>
+    <w:p>
+      <w:pPr>
+        <w:tabs>
+          <w:tab w:val="left" w:pos="7700"/>
+        </w:tabs>
+      </w:pPr>
+    </w:p>
+    <w:p>
+      <w:pPr>
+        <w:tabs>
+          <w:tab w:val="left" w:pos="7700"/>
+        </w:tabs>
+      </w:pPr>
+      <w:r>
+        <w:t xml:space="preserve">• list_basics.py / list_operations.py — All core list operations, </w:t>
+      </w:r>
+      <w:proofErr w:type="gramStart"/>
+      <w:r>
+        <w:t>sort(</w:t>
+      </w:r>
+      <w:proofErr w:type="gramEnd"/>
+      <w:r>
+        <w:t xml:space="preserve">) vs </w:t>
+      </w:r>
+      <w:proofErr w:type="gramStart"/>
+      <w:r>
+        <w:t>sorted(</w:t>
+      </w:r>
+      <w:proofErr w:type="gramEnd"/>
+      <w:r>
+        <w:t xml:space="preserve">) comparison, </w:t>
+      </w:r>
+      <w:proofErr w:type="spellStart"/>
+      <w:r>
+        <w:t>safe_</w:t>
+      </w:r>
+      <w:proofErr w:type="gramStart"/>
+      <w:r>
+        <w:t>get</w:t>
+      </w:r>
+      <w:proofErr w:type="spellEnd"/>
+      <w:r>
+        <w:t>(</w:t>
+      </w:r>
+      <w:proofErr w:type="gramEnd"/>
+      <w:r>
+        <w:t>) utility, and comprehension with filters.</w:t>
+      </w:r>
+    </w:p>
+    <w:p>
+      <w:pPr>
+        <w:tabs>
+          <w:tab w:val="left" w:pos="7700"/>
+        </w:tabs>
+      </w:pPr>
+    </w:p>
+    <w:p>
+      <w:pPr>
+        <w:tabs>
+          <w:tab w:val="left" w:pos="7700"/>
+        </w:tabs>
+      </w:pPr>
+      <w:r>
+        <w:t>• student_management.py — 9-feature CLI system (add, remove, search, sort, top 3, statistics) built using lists only.</w:t>
+      </w:r>
+    </w:p>
+    <w:p>
+      <w:pPr>
+        <w:tabs>
+          <w:tab w:val="left" w:pos="7700"/>
+        </w:tabs>
+      </w:pPr>
+    </w:p>
+    <w:p>
+      <w:pPr>
+        <w:tabs>
+          <w:tab w:val="left" w:pos="7700"/>
+        </w:tabs>
+      </w:pPr>
+      <w:r>
+        <w:t>• grade_tracker.py / list_slicing.py — Parallel list grade analysis and comprehensive slicing patterns on a 1–20 dataset.</w:t>
+      </w:r>
+    </w:p>
+    <w:p>
+      <w:pPr>
+        <w:tabs>
+          <w:tab w:val="left" w:pos="7700"/>
+        </w:tabs>
+      </w:pPr>
+    </w:p>
+    <w:p>
+      <w:pPr>
+        <w:tabs>
+          <w:tab w:val="left" w:pos="7700"/>
+        </w:tabs>
+      </w:pPr>
+      <w:r>
+        <w:t>• FEEDBACK_WEEK1.md — Full Week 1 self-assessment with ratings, challenges, insights, and Week 2 action items.</w:t>
+      </w:r>
+    </w:p>
+    <w:p>
+      <w:pPr>
+        <w:tabs>
+          <w:tab w:val="left" w:pos="7700"/>
+        </w:tabs>
+      </w:pPr>
+    </w:p>
+    <w:p>
+      <w:pPr>
+        <w:tabs>
+          <w:tab w:val="left" w:pos="7700"/>
+        </w:tabs>
+      </w:pPr>
+      <w:r>
+        <w:t>─────────────────────────────────────────</w:t>
+      </w:r>
+    </w:p>
+    <w:p>
+      <w:pPr>
+        <w:tabs>
+          <w:tab w:val="left" w:pos="7700"/>
+        </w:tabs>
+      </w:pPr>
+      <w:r>
+        <w:t>Research Sources Consulted:</w:t>
+      </w:r>
+    </w:p>
+    <w:p>
+      <w:pPr>
+        <w:tabs>
+          <w:tab w:val="left" w:pos="7700"/>
+        </w:tabs>
+      </w:pPr>
+      <w:r>
+        <w:t>─────────────────────────────────────────</w:t>
+      </w:r>
+    </w:p>
+    <w:p>
+      <w:pPr>
+        <w:tabs>
+          <w:tab w:val="left" w:pos="7700"/>
+        </w:tabs>
+      </w:pPr>
+    </w:p>
+    <w:p>
+      <w:pPr>
+        <w:tabs>
+          <w:tab w:val="left" w:pos="7700"/>
+        </w:tabs>
+      </w:pPr>
+      <w:r>
+        <w:t>Day 5 — ML Concepts:</w:t>
+      </w:r>
+    </w:p>
+    <w:p>
+      <w:pPr>
+        <w:tabs>
+          <w:tab w:val="left" w:pos="7700"/>
+        </w:tabs>
+      </w:pPr>
+      <w:r>
+        <w:t>1. ChatGPT (June 10, 2026): Key takeaway — Beginner-friendly explanation of all three ML types with everyday examples.</w:t>
+      </w:r>
+    </w:p>
+    <w:p>
+      <w:pPr>
+        <w:tabs>
+          <w:tab w:val="left" w:pos="7700"/>
+        </w:tabs>
+      </w:pPr>
+      <w:r>
+        <w:t>2. Google Gemini (June 10, 2026): Key takeaway — Detailed decision tree structure breakdown with visual diagrams.</w:t>
+      </w:r>
+    </w:p>
+    <w:p>
+      <w:pPr>
+        <w:tabs>
+          <w:tab w:val="left" w:pos="7700"/>
+        </w:tabs>
+      </w:pPr>
+      <w:r>
+        <w:t>3. Claude (June 10, 2026): Key takeaway — Most practical source with direct code examples for all three ML types.</w:t>
+      </w:r>
+    </w:p>
+    <w:p>
+      <w:pPr>
+        <w:tabs>
+          <w:tab w:val="left" w:pos="7700"/>
+        </w:tabs>
+      </w:pPr>
+      <w:r>
+        <w:t>4. Article: "Introduction to Machine Learning" by Jagriti Bansal (Medium)</w:t>
+      </w:r>
+    </w:p>
+    <w:p>
+      <w:pPr>
+        <w:tabs>
+          <w:tab w:val="left" w:pos="7700"/>
+        </w:tabs>
+      </w:pPr>
+      <w:r>
+        <w:lastRenderedPageBreak/>
+        <w:t xml:space="preserve">   URL: https://medium.com/@jagriti.bansal/introduction-to-machine-learning-types-and-working-mechanism-012710ab9c7d</w:t>
+      </w:r>
+    </w:p>
+    <w:p>
+      <w:pPr>
+        <w:tabs>
+          <w:tab w:val="left" w:pos="7700"/>
+        </w:tabs>
+      </w:pPr>
+      <w:r>
+        <w:t xml:space="preserve">   Key insight: Teacher-student analogy made supervised learning immediately clear.</w:t>
+      </w:r>
+    </w:p>
+    <w:p>
+      <w:pPr>
+        <w:tabs>
+          <w:tab w:val="left" w:pos="7700"/>
+        </w:tabs>
+      </w:pPr>
+      <w:r>
+        <w:t>5. Article: "Complete Beginner's Guide to Machine Learning" by Marcelo Gobea (Dev.to)</w:t>
+      </w:r>
+    </w:p>
+    <w:p>
+      <w:pPr>
+        <w:tabs>
+          <w:tab w:val="left" w:pos="7700"/>
+        </w:tabs>
+      </w:pPr>
+      <w:r>
+        <w:t xml:space="preserve">   URL: https://dev.to/mgobea/complete-beginners-guide-to-machine-learning-9k5</w:t>
+      </w:r>
+    </w:p>
+    <w:p>
+      <w:pPr>
+        <w:tabs>
+          <w:tab w:val="left" w:pos="7700"/>
+        </w:tabs>
+      </w:pPr>
+      <w:r>
+        <w:t xml:space="preserve">   Key insight: Best explanation of full ML workflow from data collection to deployment.</w:t>
+      </w:r>
+    </w:p>
+    <w:p>
+      <w:pPr>
+        <w:tabs>
+          <w:tab w:val="left" w:pos="7700"/>
+        </w:tabs>
+      </w:pPr>
+      <w:r>
+        <w:t>Comparison: Claude was clearest for code. Dev.to was clearest for end-to-end ML workflow.</w:t>
+      </w:r>
+    </w:p>
+    <w:p>
+      <w:pPr>
+        <w:tabs>
+          <w:tab w:val="left" w:pos="7700"/>
+        </w:tabs>
+      </w:pPr>
+    </w:p>
+    <w:p>
+      <w:pPr>
+        <w:tabs>
+          <w:tab w:val="left" w:pos="7700"/>
+        </w:tabs>
+      </w:pPr>
+      <w:r>
+        <w:t>Day 6 — Python Lists:</w:t>
+      </w:r>
+    </w:p>
+    <w:p>
+      <w:pPr>
+        <w:tabs>
+          <w:tab w:val="left" w:pos="7700"/>
+        </w:tabs>
+      </w:pPr>
+      <w:r>
+        <w:t xml:space="preserve">1. ChatGPT (June 10, 2026): Key takeaway — </w:t>
+      </w:r>
+      <w:proofErr w:type="gramStart"/>
+      <w:r>
+        <w:t>append(</w:t>
+      </w:r>
+      <w:proofErr w:type="gramEnd"/>
+      <w:r>
+        <w:t xml:space="preserve">) is </w:t>
+      </w:r>
+      <w:proofErr w:type="gramStart"/>
+      <w:r>
+        <w:t>O(</w:t>
+      </w:r>
+      <w:proofErr w:type="gramEnd"/>
+      <w:r>
+        <w:t xml:space="preserve">1); </w:t>
+      </w:r>
+      <w:proofErr w:type="gramStart"/>
+      <w:r>
+        <w:t>insert(</w:t>
+      </w:r>
+      <w:proofErr w:type="gramEnd"/>
+      <w:r>
+        <w:t xml:space="preserve">) is O(n). Prefer </w:t>
+      </w:r>
+      <w:proofErr w:type="gramStart"/>
+      <w:r>
+        <w:t>append(</w:t>
+      </w:r>
+      <w:proofErr w:type="gramEnd"/>
+      <w:r>
+        <w:t>) when order does not matter.</w:t>
+      </w:r>
+    </w:p>
+    <w:p>
+      <w:pPr>
+        <w:tabs>
+          <w:tab w:val="left" w:pos="7700"/>
+        </w:tabs>
+      </w:pPr>
+      <w:r>
+        <w:t>2. Google Gemini (June 10, 2026): Key takeaway — Visual index diagram made slicing syntax immediately clear.</w:t>
+      </w:r>
+    </w:p>
+    <w:p>
+      <w:pPr>
+        <w:tabs>
+          <w:tab w:val="left" w:pos="7700"/>
+        </w:tabs>
+      </w:pPr>
+      <w:r>
+        <w:t>3. Claude (June 10, 2026): Key takeaway — List comprehension is faster than for loops due to Python interpreter-level optimization.</w:t>
+      </w:r>
+    </w:p>
+    <w:p>
+      <w:pPr>
+        <w:tabs>
+          <w:tab w:val="left" w:pos="7700"/>
+        </w:tabs>
+      </w:pPr>
+      <w:r>
+        <w:t>4. Article: "Python Lists — Complete Guide" by Anastasiia Sydorenko (Medium)</w:t>
+      </w:r>
+    </w:p>
+    <w:p>
+      <w:pPr>
+        <w:tabs>
+          <w:tab w:val="left" w:pos="7700"/>
+        </w:tabs>
+      </w:pPr>
+      <w:r>
+        <w:t xml:space="preserve">   URL: https://medium.com/@dotsyko/python-lists-complete-guide-from-basics-to-list-comprehension-c787867ea6e2</w:t>
+      </w:r>
+    </w:p>
+    <w:p>
+      <w:pPr>
+        <w:tabs>
+          <w:tab w:val="left" w:pos="7700"/>
+        </w:tabs>
+      </w:pPr>
+      <w:r>
+        <w:t xml:space="preserve">   Key insight: Lists are dynamic arrays that auto-resize, explaining why </w:t>
+      </w:r>
+      <w:proofErr w:type="gramStart"/>
+      <w:r>
+        <w:t>append(</w:t>
+      </w:r>
+      <w:proofErr w:type="gramEnd"/>
+      <w:r>
+        <w:t xml:space="preserve">) outperforms </w:t>
+      </w:r>
+      <w:proofErr w:type="gramStart"/>
+      <w:r>
+        <w:t>insert(</w:t>
+      </w:r>
+      <w:proofErr w:type="gramEnd"/>
+      <w:r>
+        <w:t>0) on large datasets.</w:t>
+      </w:r>
+    </w:p>
+    <w:p>
+      <w:pPr>
+        <w:tabs>
+          <w:tab w:val="left" w:pos="7700"/>
+        </w:tabs>
+      </w:pPr>
+      <w:r>
+        <w:t>Comparison: Gemini was clearest for slicing visually. Claude was best for practical code and performance tips.</w:t>
+      </w:r>
+    </w:p>
+    <w:p>
+      <w:pPr>
+        <w:tabs>
+          <w:tab w:val="left" w:pos="7700"/>
+        </w:tabs>
+      </w:pPr>
+    </w:p>
+    <w:p>
+      <w:pPr>
+        <w:tabs>
+          <w:tab w:val="left" w:pos="7700"/>
+        </w:tabs>
+      </w:pPr>
+      <w:r>
+        <w:t>─────────────────────────────────────────</w:t>
+      </w:r>
+    </w:p>
+    <w:p>
+      <w:pPr>
+        <w:tabs>
+          <w:tab w:val="left" w:pos="7700"/>
+        </w:tabs>
+      </w:pPr>
+      <w:r>
+        <w:t>Challenges &amp; Solutions:</w:t>
+      </w:r>
+    </w:p>
+    <w:p>
+      <w:pPr>
+        <w:tabs>
+          <w:tab w:val="left" w:pos="7700"/>
+        </w:tabs>
+      </w:pPr>
+      <w:r>
+        <w:t>─────────────────────────────────────────</w:t>
+      </w:r>
+    </w:p>
+    <w:p>
+      <w:pPr>
+        <w:tabs>
+          <w:tab w:val="left" w:pos="7700"/>
+        </w:tabs>
+      </w:pPr>
+    </w:p>
+    <w:p>
+      <w:pPr>
+        <w:tabs>
+          <w:tab w:val="left" w:pos="7700"/>
+        </w:tabs>
+      </w:pPr>
+      <w:r>
+        <w:lastRenderedPageBreak/>
+        <w:t xml:space="preserve">• Challenge: User input "23k" caused </w:t>
+      </w:r>
+      <w:proofErr w:type="spellStart"/>
+      <w:r>
+        <w:t>ValueError</w:t>
+      </w:r>
+      <w:proofErr w:type="spellEnd"/>
+      <w:r>
+        <w:t xml:space="preserve"> crash in ML scripts.</w:t>
+      </w:r>
+    </w:p>
+    <w:p>
+      <w:pPr>
+        <w:tabs>
+          <w:tab w:val="left" w:pos="7700"/>
+        </w:tabs>
+      </w:pPr>
+      <w:r>
+        <w:t xml:space="preserve">  Solution: Wrapped all input conversions in try-except </w:t>
+      </w:r>
+      <w:proofErr w:type="spellStart"/>
+      <w:r>
+        <w:t>ValueError</w:t>
+      </w:r>
+      <w:proofErr w:type="spellEnd"/>
+      <w:r>
+        <w:t xml:space="preserve"> blocks with helpful error messages.</w:t>
+      </w:r>
+    </w:p>
+    <w:p>
+      <w:pPr>
+        <w:tabs>
+          <w:tab w:val="left" w:pos="7700"/>
+        </w:tabs>
+      </w:pPr>
+    </w:p>
+    <w:p>
+      <w:pPr>
+        <w:tabs>
+          <w:tab w:val="left" w:pos="7700"/>
+        </w:tabs>
+      </w:pPr>
+      <w:r>
+        <w:t>• Challenge: Grade tracker output skipped numbering from 3 to 5.</w:t>
+      </w:r>
+    </w:p>
+    <w:p>
+      <w:pPr>
+        <w:tabs>
+          <w:tab w:val="left" w:pos="7700"/>
+        </w:tabs>
+      </w:pPr>
+      <w:r>
+        <w:t xml:space="preserve">  Solution: Used </w:t>
+      </w:r>
+      <w:proofErr w:type="gramStart"/>
+      <w:r>
+        <w:t>enumerate(</w:t>
+      </w:r>
+      <w:proofErr w:type="spellStart"/>
+      <w:proofErr w:type="gramEnd"/>
+      <w:r>
+        <w:t>passed_students</w:t>
+      </w:r>
+      <w:proofErr w:type="spellEnd"/>
+      <w:r>
+        <w:t>, start=1) to force correct sequential numbering.</w:t>
+      </w:r>
+    </w:p>
+    <w:p>
+      <w:pPr>
+        <w:tabs>
+          <w:tab w:val="left" w:pos="7700"/>
+        </w:tabs>
+      </w:pPr>
+    </w:p>
+    <w:p>
+      <w:pPr>
+        <w:tabs>
+          <w:tab w:val="left" w:pos="7700"/>
+        </w:tabs>
+      </w:pPr>
+      <w:r>
+        <w:t>• Challenge: Folder name with space caused PowerShell error.</w:t>
+      </w:r>
+    </w:p>
+    <w:p>
+      <w:pPr>
+        <w:tabs>
+          <w:tab w:val="left" w:pos="7700"/>
+        </w:tabs>
+      </w:pPr>
+      <w:r>
+        <w:t xml:space="preserve">  Solution: Renamed to </w:t>
+      </w:r>
+      <w:proofErr w:type="spellStart"/>
+      <w:r>
+        <w:t>practical_task</w:t>
+      </w:r>
+      <w:proofErr w:type="spellEnd"/>
+      <w:r>
+        <w:t xml:space="preserve"> using underscore — also correct PEP 8 convention.</w:t>
+      </w:r>
+    </w:p>
+    <w:p>
+      <w:pPr>
+        <w:tabs>
+          <w:tab w:val="left" w:pos="7700"/>
+        </w:tabs>
+      </w:pPr>
+    </w:p>
+    <w:p>
+      <w:pPr>
+        <w:tabs>
+          <w:tab w:val="left" w:pos="7700"/>
+        </w:tabs>
+      </w:pPr>
+      <w:r>
+        <w:t>─────────────────────────────────────────</w:t>
+      </w:r>
+    </w:p>
+    <w:p>
+      <w:pPr>
+        <w:tabs>
+          <w:tab w:val="left" w:pos="7700"/>
+        </w:tabs>
+      </w:pPr>
+      <w:r>
+        <w:t>Professional Insight:</w:t>
+      </w:r>
+    </w:p>
+    <w:p>
+      <w:pPr>
+        <w:tabs>
+          <w:tab w:val="left" w:pos="7700"/>
+        </w:tabs>
+      </w:pPr>
+      <w:r>
+        <w:t>─────────────────────────────────────────</w:t>
+      </w:r>
+    </w:p>
+    <w:p>
+      <w:pPr>
+        <w:tabs>
+          <w:tab w:val="left" w:pos="7700"/>
+        </w:tabs>
+      </w:pPr>
+    </w:p>
+    <w:p>
+      <w:pPr>
+        <w:tabs>
+          <w:tab w:val="left" w:pos="7700"/>
+        </w:tabs>
+      </w:pPr>
+      <w:r>
+        <w:t xml:space="preserve">• Explainability in AI systems </w:t>
+      </w:r>
+      <w:proofErr w:type="gramStart"/>
+      <w:r>
+        <w:t>is</w:t>
+      </w:r>
+      <w:proofErr w:type="gramEnd"/>
+      <w:r>
+        <w:t xml:space="preserve"> as important as accuracy. Transparent decision paths build user trust — a core skill for production AI engineering.</w:t>
+      </w:r>
+    </w:p>
+    <w:p>
+      <w:pPr>
+        <w:tabs>
+          <w:tab w:val="left" w:pos="7700"/>
+        </w:tabs>
+      </w:pPr>
+    </w:p>
+    <w:p>
+      <w:pPr>
+        <w:tabs>
+          <w:tab w:val="left" w:pos="7700"/>
+        </w:tabs>
+      </w:pPr>
+      <w:r>
+        <w:t>• Off-by-one indexing errors in large datasets can process wrong data silently. Testing boundary values carefully is a non-negotiable professional habit.</w:t>
+      </w:r>
+    </w:p>
+    <w:p>
+      <w:pPr>
+        <w:tabs>
+          <w:tab w:val="left" w:pos="7700"/>
+        </w:tabs>
+      </w:pPr>
+    </w:p>
+    <w:p>
+      <w:pPr>
+        <w:tabs>
+          <w:tab w:val="left" w:pos="7700"/>
+        </w:tabs>
+      </w:pPr>
+      <w:r>
+        <w:t>• Week 1 key insight: Starting imperfectly is always better than waiting for perfect clarity. Momentum builds through execution, not planning.</w:t>
+      </w:r>
+    </w:p>
+    <w:p>
+      <w:pPr>
+        <w:tabs>
+          <w:tab w:val="left" w:pos="7700"/>
+        </w:tabs>
+      </w:pPr>
+    </w:p>
+    <w:p>
+      <w:pPr>
+        <w:tabs>
+          <w:tab w:val="left" w:pos="7700"/>
+        </w:tabs>
+      </w:pPr>
+      <w:r>
+        <w:t>─────────────────────────────────────────</w:t>
+      </w:r>
+    </w:p>
+    <w:p>
+      <w:pPr>
+        <w:tabs>
+          <w:tab w:val="left" w:pos="7700"/>
+        </w:tabs>
+      </w:pPr>
+      <w:r>
+        <w:t>GitHub Commits:</w:t>
+      </w:r>
+    </w:p>
+    <w:p>
+      <w:pPr>
+        <w:tabs>
+          <w:tab w:val="left" w:pos="7700"/>
+        </w:tabs>
+      </w:pPr>
+      <w:r>
+        <w:t>─────────────────────────────────────────</w:t>
+      </w:r>
+    </w:p>
+    <w:p>
+      <w:pPr>
+        <w:tabs>
+          <w:tab w:val="left" w:pos="7700"/>
+        </w:tabs>
+      </w:pPr>
+    </w:p>
+    <w:p>
+      <w:pPr>
+        <w:tabs>
+          <w:tab w:val="left" w:pos="7700"/>
+        </w:tabs>
+      </w:pPr>
+      <w:r>
+        <w:t>Repository: https://github.com/seharandleeb/ai-internship-xeven-2026</w:t>
+      </w:r>
+    </w:p>
+    <w:p>
+      <w:pPr>
+        <w:tabs>
+          <w:tab w:val="left" w:pos="7700"/>
+        </w:tabs>
+      </w:pPr>
+      <w:r>
+        <w:t>• Day 5 Commit: "Day 5 — Introduction to Machine Learning concepts"</w:t>
+      </w:r>
+    </w:p>
+    <w:p>
+      <w:pPr>
+        <w:tabs>
+          <w:tab w:val="left" w:pos="7700"/>
+        </w:tabs>
+      </w:pPr>
+      <w:r>
+        <w:t>• Day 6 Commit: "Day 6 — Python lists and list manipulation"</w:t>
+      </w:r>
+    </w:p>
+    <w:p>
+      <w:pPr>
+        <w:tabs>
+          <w:tab w:val="left" w:pos="7700"/>
+        </w:tabs>
+      </w:pPr>
+      <w:r>
+        <w:t>• Day 7 Commit: "Day 7: Week 1 assessment - FEEDBACK_WEEK1.md, self-assessment, Week 2 action items"</w:t>
+      </w:r>
+    </w:p>
+    <w:p>
+      <w:pPr>
+        <w:tabs>
+          <w:tab w:val="left" w:pos="7700"/>
+        </w:tabs>
+      </w:pPr>
+      <w:r>
+        <w:t>Direct Link: https://github.com/seharandleeb/ai-internship-xeven-2026/commits/main</w:t>
+      </w:r>
+    </w:p>
+    <w:p>
+      <w:pPr>
+        <w:tabs>
+          <w:tab w:val="left" w:pos="7700"/>
+        </w:tabs>
+      </w:pPr>
+    </w:p>
+    <w:p>
+      <w:pPr>
+        <w:tabs>
+          <w:tab w:val="left" w:pos="7700"/>
+        </w:tabs>
+      </w:pPr>
+      <w:r>
+        <w:t>─────────────────────────────────────────</w:t>
+      </w:r>
+    </w:p>
+    <w:p>
+      <w:pPr>
+        <w:tabs>
+          <w:tab w:val="left" w:pos="7700"/>
+        </w:tabs>
+      </w:pPr>
+      <w:r>
+        <w:t>Questions for Day 8:</w:t>
+      </w:r>
+    </w:p>
+    <w:p>
+      <w:pPr>
+        <w:tabs>
+          <w:tab w:val="left" w:pos="7700"/>
+        </w:tabs>
+      </w:pPr>
+      <w:r>
+        <w:t>─────────────────────────────────────────</w:t>
+      </w:r>
+    </w:p>
+    <w:p>
+      <w:pPr>
+        <w:tabs>
+          <w:tab w:val="left" w:pos="7700"/>
+        </w:tabs>
+      </w:pPr>
+    </w:p>
+    <w:p>
+      <w:pPr>
+        <w:tabs>
+          <w:tab w:val="left" w:pos="7700"/>
+        </w:tabs>
+      </w:pPr>
+      <w:r>
+        <w:t>• When should I use a list versus a tuple and what are the performance differences?</w:t>
+      </w:r>
+    </w:p>
+    <w:p>
+      <w:pPr>
+        <w:tabs>
+          <w:tab w:val="left" w:pos="7700"/>
+        </w:tabs>
+      </w:pPr>
+      <w:r>
+        <w:t>• Are list comprehensions always faster than for loops or does it depend on list size?</w:t>
+      </w:r>
+    </w:p>
+    <w:p>
+      <w:pPr>
+        <w:tabs>
+          <w:tab w:val="left" w:pos="7700"/>
+        </w:tabs>
+      </w:pPr>
+      <w:r>
+        <w:t>• When building real decision trees in Scikit-learn, how do we decide which feature to use as the root node?</w:t>
+      </w:r>
+    </w:p>
+    <w:p>
+      <w:pPr>
+        <w:tabs>
+          <w:tab w:val="left" w:pos="7700"/>
+        </w:tabs>
+      </w:pPr>
+    </w:p>
+    <w:p>
+      <w:pPr>
+        <w:tabs>
+          <w:tab w:val="left" w:pos="7700"/>
+        </w:tabs>
+      </w:pPr>
+      <w:r>
+        <w:t>Thank you for your guidance and support!</w:t>
+      </w:r>
+    </w:p>
+    <w:p>
+      <w:pPr>
+        <w:tabs>
+          <w:tab w:val="left" w:pos="7700"/>
+        </w:tabs>
+      </w:pPr>
+    </w:p>
+    <w:p>
+      <w:pPr>
+        <w:tabs>
+          <w:tab w:val="left" w:pos="7700"/>
+        </w:tabs>
+      </w:pPr>
+      <w:r>
+        <w:t>Best regards,</w:t>
+      </w:r>
+    </w:p>
+    <w:p>
+      <w:pPr>
+        <w:tabs>
+          <w:tab w:val="left" w:pos="7700"/>
+        </w:tabs>
+      </w:pPr>
+      <w:r>
+        <w:t>Sehar Andleeb</w:t>
+      </w:r>
+    </w:p>
+    <w:p>
+      <w:pPr>
+        <w:tabs>
+          <w:tab w:val="left" w:pos="7700"/>
+        </w:tabs>
+      </w:pPr>
+      <w:r>
+        <w:t>AI Engineer Intern</w:t>
+      </w:r>
+    </w:p>
+    <w:p>
+      <w:pPr>
+        <w:tabs>
+          <w:tab w:val="left" w:pos="7700"/>
+        </w:tabs>
+      </w:pPr>
+      <w:r>
+        <w:t>Xeven Solutions</w:t>
+      </w:r>
     </w:p>
     <w:sectPr>
       <w:pgSz w:w="12240" w:h="15840"/>
@@ -9156,6 +10910,7 @@
   <w:style w:type="character" w:default="1" w:styleId="DefaultParagraphFont">
     <w:name w:val="Default Paragraph Font"/>
     <w:uiPriority w:val="1"/>
+    <w:semiHidden/>
     <w:unhideWhenUsed/>
   </w:style>
   <w:style w:type="table" w:default="1" w:styleId="TableNormal">

</xml_diff>